<commit_message>
résumé: restore leonardsibelius.com and Outlast as clickable links
The header rewrite that fixed the broken separators had flattened the two
remaining links to plain text. Re-added them as hyperlinks —
leonardsibelius.com -> https://leonardsibelius.com and Outlast newsletter ->
https://wpoutlast.substack.com — and regenerated the PDF.
</commit_message>
<xml_diff>
--- a/walt-parkman-resume-8-2026.docx
+++ b/walt-parkman-resume-8-2026.docx
@@ -45,9 +45,25 @@
         <w:spacing w:after="120"/>
         <w:jc w:val="center"/>
       </w:pPr>
-      <w:r>
-        <w:t>leonardsibelius.com  |  Outlast newsletter</w:t>
-      </w:r>
+      <w:hyperlink r:id="rId5" w:history="1">
+        <w:r>
+          <w:rPr>
+            <w:rStyle w:val="Hyperlink"/>
+          </w:rPr>
+          <w:t>leonardsibelius.com</w:t>
+        </w:r>
+      </w:hyperlink>
+      <w:r>
+        <w:t xml:space="preserve">  |  </w:t>
+      </w:r>
+      <w:hyperlink r:id="rId6" w:history="1">
+        <w:r>
+          <w:rPr>
+            <w:rStyle w:val="Hyperlink"/>
+          </w:rPr>
+          <w:t>Outlast newsletter</w:t>
+        </w:r>
+      </w:hyperlink>
     </w:p>
     <w:p>
       <w:pPr>
@@ -120,7 +136,7 @@
         </w:rPr>
         <w:t xml:space="preserve">Free download: </w:t>
       </w:r>
-      <w:hyperlink r:id="rId5" w:history="1">
+      <w:hyperlink r:id="rId7" w:history="1">
         <w:r>
           <w:rPr>
             <w:rStyle w:val="Hyperlink"/>
@@ -135,7 +151,7 @@
         </w:rPr>
         <w:t xml:space="preserve">   ·   </w:t>
       </w:r>
-      <w:hyperlink r:id="rId6" w:history="1">
+      <w:hyperlink r:id="rId8" w:history="1">
         <w:r>
           <w:rPr>
             <w:rStyle w:val="Hyperlink"/>
@@ -1275,6 +1291,18 @@
       <w:szCs w:val="20"/>
     </w:rPr>
   </w:style>
+  <w:style w:type="character" w:styleId="UnresolvedMention">
+    <w:name w:val="Unresolved Mention"/>
+    <w:basedOn w:val="DefaultParagraphFont"/>
+    <w:uiPriority w:val="99"/>
+    <w:semiHidden/>
+    <w:unhideWhenUsed/>
+    <w:rsid w:val="00A84798"/>
+    <w:rPr>
+      <w:color w:val="605E5C"/>
+      <w:shd w:val="clear" w:color="auto" w:fill="E1DFDD"/>
+    </w:rPr>
+  </w:style>
 </w:styles>
 </file>
 

</xml_diff>